<commit_message>
Cameroun : analyse critique des trois documents programmatiques et plan amélioré en 8 chantiers (Markdown + Word)
Intègre les vérifications (14 affirmations du plan, recherche sur les propositions ajoutées),
corrige le diagnostic du 19/10 sur le RGPH4 (collecté en 2026) et étend le convertisseur Word
(tableaux, titres de niveau 3, italique).

Co-Authored-By: Claude Opus 5.5 <noreply@anthropic.com>
Claude-Session: https://claude.ai/code/session_012Wp1za2jYQfXg3djKdum4N
</commit_message>
<xml_diff>
--- a/cameroun/outputs/note_decideur_2026-10-19.docx
+++ b/cameroun/outputs/note_decideur_2026-10-19.docx
@@ -209,7 +209,17 @@
         <w:t xml:space="preserve">Données anciennes.</w:t>
       </w:r>
       <w:r>
-        <w:t xml:space="preserve"> Il n'y a pas eu de recensement depuis 2005. Les données de santé et de nutrition datent de 2018, celles de l'emploi de 2021. L'effet des chocs de 2023 à 2026 sur les ménages n'est </w:t>
+        <w:t xml:space="preserve"> Le dernier recensement exploité date de 2005 ; le 4e recensement a été collecté entre avril et septembre 2026, avec des résultats attendus début 2027 (</w:t>
+      </w:r>
+      <w:r>
+        <w:rPr>
+          <w:i/>
+          <w:iCs/>
+        </w:rPr>
+        <w:t xml:space="preserve">correctif du 20/10/2026</w:t>
+      </w:r>
+      <w:r>
+        <w:t xml:space="preserve">). Les données de santé et de nutrition datent de 2018, celles de l'emploi de 2021. L'effet des chocs de 2023 à 2026 sur les ménages n'est </w:t>
       </w:r>
       <w:r>
         <w:rPr>
@@ -1107,5 +1117,22 @@
       <w:szCs w:val="24"/>
     </w:rPr>
   </w:style>
+  <w:style w:type="paragraph" w:styleId="Heading2">
+    <w:name w:val="Heading 2"/>
+    <w:basedOn w:val="Normal"/>
+    <w:next w:val="Normal"/>
+    <w:qFormat/>
+    <w:pPr>
+      <w:spacing w:after="80" w:before="160"/>
+      <w:outlineLvl w:val="1"/>
+    </w:pPr>
+    <w:rPr>
+      <w:b/>
+      <w:bCs/>
+      <w:color w:val="2E5496"/>
+      <w:sz w:val="22"/>
+      <w:szCs w:val="22"/>
+    </w:rPr>
+  </w:style>
 </w:styles>
 </file>
</xml_diff>